<commit_message>
Update Assignment 6 package with verified DGX diagnostics
</commit_message>
<xml_diff>
--- a/candidate-contributions/assignment-6-lora/LoRA_Learning_and_Experiment_Record.docx
+++ b/candidate-contributions/assignment-6-lora/LoRA_Learning_and_Experiment_Record.docx
@@ -21,7 +21,7 @@
           <w:color w:val="5B6875"/>
           <w:sz w:val="16"/>
         </w:rPr>
-        <w:t>NYU Advanced Business Informatics | Assignment 6 | 32B DGX Spark experiment | 21 October 2026</w:t>
+        <w:t>NYU Advanced Business Informatics | Assignment 6 | Yinuo Lou | 32B DGX Spark experiment | 21 October 2026</w:t>
       </w:r>
     </w:p>
     <w:p>
@@ -35,7 +35,7 @@
         <w:t xml:space="preserve">Finding. </w:t>
       </w:r>
       <w:r>
-        <w:t>The corrected 32B LoRA run completed on DGX, but did not improve internal-validation routing over the base model. I do not recommend adopting this adapter; the comparison also exposed a scoring-method sensitivity and weak fraud recall.</w:t>
+        <w:t>The corrected 32B run completed, but this setup showed no validation gain over the base model. The training result does not yet establish that LoRA learned a useful routing distinction; I recommend further controlled comparison before adoption.</w:t>
       </w:r>
     </w:p>
     <w:p>
@@ -74,7 +74,7 @@
     </w:p>
     <w:p>
       <w:r>
-        <w:t>Corrected Slurm job 253 completed on spark-4694 with an NVIDIA GB10; Torch 2.13.0+cu130, Transformers 5.17.0, and PEFT 0.21.2. The checkpoint had 32,772,723,712 parameters, with 4,194,304 trainable LoRA parameters (0.0128%). Mean epoch training loss was 2.9943. The run took 659.0 seconds including model load, baseline scoring, training, adapted scoring, and reload; peak CUDA allocation was 66,722,334,720 bytes (62.2 GiB). Reloaded-adapter predictions exactly matched the in-memory adapted predictions.</w:t>
+        <w:t>Corrected Slurm job 253 completed on spark-4694 with an NVIDIA GB10; Torch 2.13.0+cu130, Transformers 5.17.0, and PEFT 0.21.2. The checkpoint had 32,772,723,712 parameters, with 4,194,304 trainable LoRA parameters (0.0128%). Diagnostic repeat job 255 on the same Development split had mean loss 2.9943; first/last 50-step means were 2.8968/2.9586. Base and adapted mean Billing-minus-Fraud sequence log-likelihood margins were both 4.760; mean absolute per-example margin change was 0 across 71 examples, with no sign flips. Post-run CPU inspection found all 128 saved LoRA B tensors exactly zero. The adapter therefore showed no effective update in this run; the update path needs debugging, not an efficacy conclusion. Job 255 took 971.4 seconds; peak CUDA allocation was 66,722,334,720 bytes (62.1 GiB), the full 32B-model run peak rather than a LoRA-only increment. The unmatched 61.2 GiB pilot is not an exact cost comparison. The main incremental costs to evaluate are training time and adapter lifecycle.</w:t>
       </w:r>
     </w:p>
     <w:tbl>
@@ -508,7 +508,7 @@
               <w:rPr>
                 <w:sz w:val="15"/>
               </w:rPr>
-              <w:t>Conclusion depends on scoring</w:t>
+              <w:t>One validation case changed</w:t>
             </w:r>
           </w:p>
         </w:tc>
@@ -629,7 +629,7 @@
           <w:i/>
           <w:sz w:val="16"/>
         </w:rPr>
-        <w:t>Sequence-score confusion: billing 55 correct / 2 fraud false positives; fraud 6 correct / 8 missed. Mean-token scoring misses 9 of 14 fraud cases.</w:t>
+        <w:t>Sequence-score confusion: billing 55 correct / 2 fraud false positives; fraud 6 correct / 8 missed. Mean-token scoring changed one validation case (85.9% to 84.5%; fraud recall 6/14 to 5/14), a secondary observation rather than evidence about the LoRA-vs-base difference.</w:t>
       </w:r>
     </w:p>
     <w:p>
@@ -647,7 +647,7 @@
     </w:p>
     <w:p>
       <w:r>
-        <w:t>Do not adopt this LoRA candidate on current evidence. It provides no internal-validation gain over base, uses about 62.2 GiB peak GPU memory, and misses 8 of 14 fraud/security cases under the primary sequence score. On only 14 fraud cases, recall is uncertain; the scoring sensitivity (85.9% versus 84.5% accuracy) further weakens any claim of a robust difference. The labels are synthetic instructional references, not adjudicated bank policy. Before selecting among base, prompted, and adapted systems, freeze one shared split, prompt, and scoring rule; report the majority baseline, confusion matrix, per-class precision/recall/F1, macro-F1, latency, and cost. Do not tune on the official holdout. Employee review remains mandatory, especially for ambiguous or insufficient-evidence cases.</w:t>
+        <w:t>The result is not evidence that LoRA is ineffective; it shows that this run did not produce an effective adapter update. Loss rose from 2.8968 (first 50 steps) to 2.9586 (last 50), the mean absolute base/adapted margin change was 0, and saved LoRA B tensors were zero. Debug gradient flow and optimizer updates, then rerun a small overfit sanity check before interpreting validation performance. Fraud/security recall was 6/14, based on only 14 cases, so it is uncertain. The labels are synthetic instructional references, not adjudicated bank policy. Before choosing among base, prompted, and adapted systems, freeze one shared split, prompt, and scoring rule; report the majority baseline, confusion matrix, per-class precision/recall/F1, macro-F1, latency, and cost. Do not tune on the official holdout. Employee review remains mandatory.</w:t>
       </w:r>
     </w:p>
     <w:p>
@@ -660,7 +660,7 @@
     </w:p>
     <w:p>
       <w:r>
-        <w:t>Candidate files are isolated on the personal branch louyinuo/a6-lora-candidate. The implementation and aggregate-evidence commit is eba757b; this final record is a follow-on branch update. The revised run script, portable configuration, aggregate result, and evidence excerpt are included in the package. The repo has no remote configured, so no GitHub push is claimed. Review the corrected token-boundary handling, job 253 result, identical adapter-reload predictions, and the comparison protocol before deciding whether to carry any code into the team prototype. Two official held-out examples were inadvertently previewed in an earlier session; they were not used for training or tuning. The team should document this exposure and decide how it affects the final evaluation.</w:t>
+        <w:t>Candidate repository: pingan1224/abi-complaint-management-poc; branch: louyinuo/a6-lora-candidate; implementation and DGX-evidence commit: cb7acd0a0226dae5c7b0dbac23c4e1a11791ae4d. The package also includes the final branch commit ID and a format-patch for the report/package update. Private NAS paths are replaced with placeholders; the model, split, hyperparameters, and resource request correspond to the recorded run. Review the corrected token-boundary handling, loss and margin diagnostics, adapter-reload predictions, and comparison protocol before deciding whether to carry code into the team prototype. Two official held-out examples were inadvertently previewed earlier; they were not used for training or tuning. The team should document this exposure and decide how it affects the final evaluation.</w:t>
       </w:r>
     </w:p>
     <w:p>
@@ -673,7 +673,7 @@
     </w:p>
     <w:p>
       <w:r>
-        <w:t>AI assisted with implementation, debugging, and drafting. The reported hardware, software versions, training counts, metrics, runtime, memory, and reload parity were checked against the DGX job 253 result and log through JupyterLab. The evidence is a Development-only diagnostic; it is not a held-out test or production approval. I will personally review the package and make sure this record reflects my understanding before submitting.</w:t>
+        <w:t>AI assisted with implementation, debugging, and drafting. Hardware, software versions, training counts, metrics, loss windows, margins, Slurm state, and adapter tensor values were checked against the DGX result, log, and saved adapter through JupyterLab. Evidence is a Development-only diagnostic, not a held-out test or production approval.</w:t>
       </w:r>
     </w:p>
     <w:p>
@@ -684,10 +684,10 @@
         <w:rPr>
           <w:b/>
         </w:rPr>
-        <w:t xml:space="preserve">Reflection (123 words). </w:t>
+        <w:t xml:space="preserve">Reflection (112 words). </w:t>
       </w:r>
       <w:r>
-        <w:t>AI helped me move from the team's routing problem to a runnable experiment and made the autograd failure easier to diagnose. The most transferable lesson was that a prompt and answer may not tokenize independently at their text boundary; checking the actual token prefix changed how I will build future causal-language-model training pipelines. I also learned that a completed run is not evidence of a useful adapter: base and adapted predictions were identical, while fraud recall remained low and changed with the scoring rule. Before submission, I will review the DGX evidence and code myself, and I will explain these limits to my team. I would compare base, prompted, and adapted systems on one frozen protocol before recommending any model for employee-assisted use.</w:t>
+        <w:t>This experiment changed how I define a successful fine-tuning result. A 32B job can finish and save an adapter without showing that it learned a useful routing distinction. The token-boundary issue made this concrete: separately tokenizing prompt and answer shifted the loss mask for many examples, so checking the combined token sequence matters as much as watching training complete. I also learned to inspect route-score margins and step-level loss, not just final predictions. On this small Development split, adapted predictions matched the base, and fraud recall remained uncertain because there were only 14 fraud cases. I would require a controlled base, prompted, and adapted comparison before recommending a model for employee-assisted use.</w:t>
       </w:r>
     </w:p>
     <w:sectPr>

</xml_diff>